<commit_message>
profile page frontend complete
</commit_message>
<xml_diff>
--- a/Bootstrap/Bootstrap.docx
+++ b/Bootstrap/Bootstrap.docx
@@ -516,14 +516,7 @@
           <w:rStyle w:val="HTMLCode"/>
           <w:rFonts w:ascii="Times New Roman" w:eastAsiaTheme="minorHAnsi" w:hAnsi="Times New Roman" w:cs="Times New Roman"/>
         </w:rPr>
-        <w:t>navbar-expand-</w:t>
-      </w:r>
-      <w:r>
-        <w:rPr>
-          <w:rStyle w:val="HTMLCode"/>
-          <w:rFonts w:ascii="Times New Roman" w:eastAsiaTheme="minorHAnsi" w:hAnsi="Times New Roman" w:cs="Times New Roman"/>
-        </w:rPr>
-        <w:t>xl</w:t>
+        <w:t>navbar-expand-xl</w:t>
       </w:r>
     </w:p>
     <w:p>
@@ -545,14 +538,7 @@
           <w:rStyle w:val="HTMLCode"/>
           <w:rFonts w:ascii="Times New Roman" w:eastAsiaTheme="minorHAnsi" w:hAnsi="Times New Roman" w:cs="Times New Roman"/>
         </w:rPr>
-        <w:t>navbar-expand-</w:t>
-      </w:r>
-      <w:r>
-        <w:rPr>
-          <w:rStyle w:val="HTMLCode"/>
-          <w:rFonts w:ascii="Times New Roman" w:eastAsiaTheme="minorHAnsi" w:hAnsi="Times New Roman" w:cs="Times New Roman"/>
-        </w:rPr>
-        <w:t>md</w:t>
+        <w:t>navbar-expand-md</w:t>
       </w:r>
     </w:p>
     <w:p>
@@ -582,14 +568,7 @@
           <w:rStyle w:val="HTMLCode"/>
           <w:rFonts w:ascii="Times New Roman" w:eastAsiaTheme="minorHAnsi" w:hAnsi="Times New Roman" w:cs="Times New Roman"/>
         </w:rPr>
-        <w:t>l</w:t>
-      </w:r>
-      <w:r>
-        <w:rPr>
-          <w:rStyle w:val="HTMLCode"/>
-          <w:rFonts w:ascii="Times New Roman" w:eastAsiaTheme="minorHAnsi" w:hAnsi="Times New Roman" w:cs="Times New Roman"/>
-        </w:rPr>
-        <w:t>g</w:t>
+        <w:t>lg</w:t>
       </w:r>
       <w:proofErr w:type="spellEnd"/>
     </w:p>
@@ -846,38 +825,32 @@
         <w:rPr>
           <w:rFonts w:ascii="Times New Roman" w:hAnsi="Times New Roman" w:cs="Times New Roman"/>
         </w:rPr>
+        <w:t>-md</w:t>
+      </w:r>
+    </w:p>
+    <w:p>
+      <w:pPr>
+        <w:pStyle w:val="ListParagraph"/>
+        <w:numPr>
+          <w:ilvl w:val="3"/>
+          <w:numId w:val="1"/>
+        </w:numPr>
+        <w:rPr>
+          <w:rFonts w:ascii="Times New Roman" w:hAnsi="Times New Roman" w:cs="Times New Roman"/>
+        </w:rPr>
+      </w:pPr>
+      <w:r>
+        <w:rPr>
+          <w:rFonts w:ascii="Times New Roman" w:hAnsi="Times New Roman" w:cs="Times New Roman"/>
+        </w:rPr>
+        <w:t>container</w:t>
+      </w:r>
+      <w:r>
+        <w:rPr>
+          <w:rFonts w:ascii="Times New Roman" w:hAnsi="Times New Roman" w:cs="Times New Roman"/>
+        </w:rPr>
         <w:t>-</w:t>
       </w:r>
-      <w:r>
-        <w:rPr>
-          <w:rFonts w:ascii="Times New Roman" w:hAnsi="Times New Roman" w:cs="Times New Roman"/>
-        </w:rPr>
-        <w:t>md</w:t>
-      </w:r>
-    </w:p>
-    <w:p>
-      <w:pPr>
-        <w:pStyle w:val="ListParagraph"/>
-        <w:numPr>
-          <w:ilvl w:val="3"/>
-          <w:numId w:val="1"/>
-        </w:numPr>
-        <w:rPr>
-          <w:rFonts w:ascii="Times New Roman" w:hAnsi="Times New Roman" w:cs="Times New Roman"/>
-        </w:rPr>
-      </w:pPr>
-      <w:r>
-        <w:rPr>
-          <w:rFonts w:ascii="Times New Roman" w:hAnsi="Times New Roman" w:cs="Times New Roman"/>
-        </w:rPr>
-        <w:t>container</w:t>
-      </w:r>
-      <w:r>
-        <w:rPr>
-          <w:rFonts w:ascii="Times New Roman" w:hAnsi="Times New Roman" w:cs="Times New Roman"/>
-        </w:rPr>
-        <w:t>-</w:t>
-      </w:r>
       <w:proofErr w:type="spellStart"/>
       <w:r>
         <w:rPr>
@@ -1033,6 +1006,821 @@
         </w:rPr>
         <w:t xml:space="preserve">See the bootstrap code  again in detail </w:t>
       </w:r>
+    </w:p>
+    <w:p>
+      <w:pPr>
+        <w:rPr>
+          <w:rFonts w:ascii="Times New Roman" w:hAnsi="Times New Roman" w:cs="Times New Roman"/>
+        </w:rPr>
+      </w:pPr>
+    </w:p>
+    <w:p>
+      <w:pPr>
+        <w:rPr>
+          <w:rFonts w:ascii="Times New Roman" w:hAnsi="Times New Roman" w:cs="Times New Roman"/>
+        </w:rPr>
+      </w:pPr>
+    </w:p>
+    <w:p>
+      <w:pPr>
+        <w:rPr>
+          <w:rFonts w:ascii="Times New Roman" w:hAnsi="Times New Roman" w:cs="Times New Roman"/>
+        </w:rPr>
+      </w:pPr>
+    </w:p>
+    <w:p>
+      <w:pPr>
+        <w:rPr>
+          <w:rFonts w:ascii="Times New Roman" w:hAnsi="Times New Roman" w:cs="Times New Roman"/>
+        </w:rPr>
+      </w:pPr>
+    </w:p>
+    <w:p>
+      <w:pPr>
+        <w:rPr>
+          <w:rFonts w:ascii="Times New Roman" w:hAnsi="Times New Roman" w:cs="Times New Roman"/>
+        </w:rPr>
+      </w:pPr>
+    </w:p>
+    <w:p>
+      <w:pPr>
+        <w:rPr>
+          <w:rFonts w:ascii="Times New Roman" w:hAnsi="Times New Roman" w:cs="Times New Roman"/>
+        </w:rPr>
+      </w:pPr>
+      <w:r>
+        <w:rPr>
+          <w:rFonts w:ascii="Times New Roman" w:hAnsi="Times New Roman" w:cs="Times New Roman"/>
+          <w:b/>
+          <w:bCs/>
+        </w:rPr>
+        <w:lastRenderedPageBreak/>
+        <w:t xml:space="preserve">Container: </w:t>
+      </w:r>
+      <w:r>
+        <w:rPr>
+          <w:rFonts w:ascii="Times New Roman" w:hAnsi="Times New Roman" w:cs="Times New Roman"/>
+        </w:rPr>
+        <w:t>create fixed width container that is responsive to screen size.</w:t>
+      </w:r>
+      <w:r>
+        <w:rPr>
+          <w:rFonts w:ascii="Times New Roman" w:hAnsi="Times New Roman" w:cs="Times New Roman"/>
+        </w:rPr>
+        <w:t xml:space="preserve"> This width of container change with different breakpoint according to screen size.</w:t>
+      </w:r>
+    </w:p>
+    <w:p>
+      <w:pPr>
+        <w:rPr>
+          <w:rFonts w:ascii="Times New Roman" w:hAnsi="Times New Roman" w:cs="Times New Roman"/>
+        </w:rPr>
+      </w:pPr>
+      <w:proofErr w:type="spellStart"/>
+      <w:r>
+        <w:rPr>
+          <w:rFonts w:ascii="Times New Roman" w:hAnsi="Times New Roman" w:cs="Times New Roman"/>
+          <w:b/>
+          <w:bCs/>
+        </w:rPr>
+        <w:t>bg</w:t>
+      </w:r>
+      <w:proofErr w:type="spellEnd"/>
+      <w:r>
+        <w:rPr>
+          <w:rFonts w:ascii="Times New Roman" w:hAnsi="Times New Roman" w:cs="Times New Roman"/>
+          <w:b/>
+          <w:bCs/>
+        </w:rPr>
+        <w:t xml:space="preserve">: </w:t>
+      </w:r>
+      <w:r>
+        <w:rPr>
+          <w:rFonts w:ascii="Times New Roman" w:hAnsi="Times New Roman" w:cs="Times New Roman"/>
+        </w:rPr>
+        <w:t xml:space="preserve">for </w:t>
+      </w:r>
+      <w:r>
+        <w:rPr>
+          <w:rFonts w:ascii="Times New Roman" w:hAnsi="Times New Roman" w:cs="Times New Roman"/>
+        </w:rPr>
+        <w:t>background</w:t>
+      </w:r>
+      <w:r>
+        <w:rPr>
+          <w:rFonts w:ascii="Times New Roman" w:hAnsi="Times New Roman" w:cs="Times New Roman"/>
+        </w:rPr>
+        <w:t xml:space="preserve"> </w:t>
+      </w:r>
+      <w:r>
+        <w:rPr>
+          <w:rFonts w:ascii="Times New Roman" w:hAnsi="Times New Roman" w:cs="Times New Roman"/>
+        </w:rPr>
+        <w:t>colour.</w:t>
+      </w:r>
+    </w:p>
+    <w:p>
+      <w:pPr>
+        <w:rPr>
+          <w:rFonts w:ascii="Times New Roman" w:hAnsi="Times New Roman" w:cs="Times New Roman"/>
+        </w:rPr>
+      </w:pPr>
+      <w:r>
+        <w:rPr>
+          <w:rFonts w:ascii="Times New Roman" w:hAnsi="Times New Roman" w:cs="Times New Roman"/>
+          <w:b/>
+          <w:bCs/>
+        </w:rPr>
+        <w:t>m:</w:t>
+      </w:r>
+      <w:r>
+        <w:rPr>
+          <w:rFonts w:ascii="Times New Roman" w:hAnsi="Times New Roman" w:cs="Times New Roman"/>
+          <w:b/>
+          <w:bCs/>
+        </w:rPr>
+        <w:t xml:space="preserve"> </w:t>
+      </w:r>
+      <w:r>
+        <w:rPr>
+          <w:rFonts w:ascii="Times New Roman" w:hAnsi="Times New Roman" w:cs="Times New Roman"/>
+        </w:rPr>
+        <w:t>all side margin.</w:t>
+      </w:r>
+    </w:p>
+    <w:p>
+      <w:pPr>
+        <w:rPr>
+          <w:rFonts w:ascii="Times New Roman" w:hAnsi="Times New Roman" w:cs="Times New Roman"/>
+        </w:rPr>
+      </w:pPr>
+      <w:proofErr w:type="spellStart"/>
+      <w:r>
+        <w:rPr>
+          <w:rFonts w:ascii="Times New Roman" w:hAnsi="Times New Roman" w:cs="Times New Roman"/>
+          <w:b/>
+          <w:bCs/>
+        </w:rPr>
+        <w:t>mt</w:t>
+      </w:r>
+      <w:proofErr w:type="spellEnd"/>
+      <w:r>
+        <w:rPr>
+          <w:rFonts w:ascii="Times New Roman" w:hAnsi="Times New Roman" w:cs="Times New Roman"/>
+          <w:b/>
+          <w:bCs/>
+        </w:rPr>
+        <w:t xml:space="preserve">: </w:t>
+      </w:r>
+      <w:r>
+        <w:rPr>
+          <w:rFonts w:ascii="Times New Roman" w:hAnsi="Times New Roman" w:cs="Times New Roman"/>
+        </w:rPr>
+        <w:t>margin-top</w:t>
+      </w:r>
+    </w:p>
+    <w:p>
+      <w:pPr>
+        <w:rPr>
+          <w:rFonts w:ascii="Times New Roman" w:hAnsi="Times New Roman" w:cs="Times New Roman"/>
+        </w:rPr>
+      </w:pPr>
+      <w:r>
+        <w:rPr>
+          <w:rFonts w:ascii="Times New Roman" w:hAnsi="Times New Roman" w:cs="Times New Roman"/>
+          <w:b/>
+          <w:bCs/>
+        </w:rPr>
+        <w:t>mb:</w:t>
+      </w:r>
+      <w:r>
+        <w:rPr>
+          <w:rFonts w:ascii="Times New Roman" w:hAnsi="Times New Roman" w:cs="Times New Roman"/>
+          <w:b/>
+          <w:bCs/>
+        </w:rPr>
+        <w:t xml:space="preserve"> </w:t>
+      </w:r>
+      <w:r>
+        <w:rPr>
+          <w:rFonts w:ascii="Times New Roman" w:hAnsi="Times New Roman" w:cs="Times New Roman"/>
+        </w:rPr>
+        <w:t>margin-bottom</w:t>
+      </w:r>
+    </w:p>
+    <w:p>
+      <w:pPr>
+        <w:rPr>
+          <w:rFonts w:ascii="Times New Roman" w:hAnsi="Times New Roman" w:cs="Times New Roman"/>
+        </w:rPr>
+      </w:pPr>
+      <w:r>
+        <w:rPr>
+          <w:rFonts w:ascii="Times New Roman" w:hAnsi="Times New Roman" w:cs="Times New Roman"/>
+          <w:b/>
+          <w:bCs/>
+        </w:rPr>
+        <w:t xml:space="preserve">ml: </w:t>
+      </w:r>
+      <w:r>
+        <w:rPr>
+          <w:rFonts w:ascii="Times New Roman" w:hAnsi="Times New Roman" w:cs="Times New Roman"/>
+        </w:rPr>
+        <w:t>margin-left</w:t>
+      </w:r>
+    </w:p>
+    <w:p>
+      <w:pPr>
+        <w:rPr>
+          <w:rFonts w:ascii="Times New Roman" w:hAnsi="Times New Roman" w:cs="Times New Roman"/>
+        </w:rPr>
+      </w:pPr>
+      <w:proofErr w:type="spellStart"/>
+      <w:r>
+        <w:rPr>
+          <w:rFonts w:ascii="Times New Roman" w:hAnsi="Times New Roman" w:cs="Times New Roman"/>
+          <w:b/>
+          <w:bCs/>
+        </w:rPr>
+        <w:t>mr</w:t>
+      </w:r>
+      <w:proofErr w:type="spellEnd"/>
+      <w:r>
+        <w:rPr>
+          <w:rFonts w:ascii="Times New Roman" w:hAnsi="Times New Roman" w:cs="Times New Roman"/>
+          <w:b/>
+          <w:bCs/>
+        </w:rPr>
+        <w:t xml:space="preserve">: </w:t>
+      </w:r>
+      <w:r>
+        <w:rPr>
+          <w:rFonts w:ascii="Times New Roman" w:hAnsi="Times New Roman" w:cs="Times New Roman"/>
+        </w:rPr>
+        <w:t>margin-right</w:t>
+      </w:r>
+    </w:p>
+    <w:p>
+      <w:pPr>
+        <w:rPr>
+          <w:rFonts w:ascii="Times New Roman" w:hAnsi="Times New Roman" w:cs="Times New Roman"/>
+        </w:rPr>
+      </w:pPr>
+      <w:r>
+        <w:rPr>
+          <w:rFonts w:ascii="Times New Roman" w:hAnsi="Times New Roman" w:cs="Times New Roman"/>
+          <w:b/>
+          <w:bCs/>
+        </w:rPr>
+        <w:t xml:space="preserve">mx: </w:t>
+      </w:r>
+      <w:r>
+        <w:rPr>
+          <w:rFonts w:ascii="Times New Roman" w:hAnsi="Times New Roman" w:cs="Times New Roman"/>
+        </w:rPr>
+        <w:t>margin-horizontal</w:t>
+      </w:r>
+      <w:r>
+        <w:rPr>
+          <w:rFonts w:ascii="Times New Roman" w:hAnsi="Times New Roman" w:cs="Times New Roman"/>
+        </w:rPr>
+        <w:t xml:space="preserve"> (combine ml, </w:t>
+      </w:r>
+      <w:proofErr w:type="spellStart"/>
+      <w:r>
+        <w:rPr>
+          <w:rFonts w:ascii="Times New Roman" w:hAnsi="Times New Roman" w:cs="Times New Roman"/>
+        </w:rPr>
+        <w:t>mr</w:t>
+      </w:r>
+      <w:proofErr w:type="spellEnd"/>
+      <w:r>
+        <w:rPr>
+          <w:rFonts w:ascii="Times New Roman" w:hAnsi="Times New Roman" w:cs="Times New Roman"/>
+        </w:rPr>
+        <w:t>)</w:t>
+      </w:r>
+    </w:p>
+    <w:p>
+      <w:pPr>
+        <w:rPr>
+          <w:rFonts w:ascii="Times New Roman" w:hAnsi="Times New Roman" w:cs="Times New Roman"/>
+        </w:rPr>
+      </w:pPr>
+      <w:proofErr w:type="spellStart"/>
+      <w:r>
+        <w:rPr>
+          <w:rFonts w:ascii="Times New Roman" w:hAnsi="Times New Roman" w:cs="Times New Roman"/>
+          <w:b/>
+          <w:bCs/>
+        </w:rPr>
+        <w:t>my</w:t>
+      </w:r>
+      <w:proofErr w:type="spellEnd"/>
+      <w:r>
+        <w:rPr>
+          <w:rFonts w:ascii="Times New Roman" w:hAnsi="Times New Roman" w:cs="Times New Roman"/>
+          <w:b/>
+          <w:bCs/>
+        </w:rPr>
+        <w:t xml:space="preserve">: </w:t>
+      </w:r>
+      <w:r>
+        <w:rPr>
+          <w:rFonts w:ascii="Times New Roman" w:hAnsi="Times New Roman" w:cs="Times New Roman"/>
+        </w:rPr>
+        <w:t>margin-vertical</w:t>
+      </w:r>
+      <w:r>
+        <w:rPr>
+          <w:rFonts w:ascii="Times New Roman" w:hAnsi="Times New Roman" w:cs="Times New Roman"/>
+        </w:rPr>
+        <w:t xml:space="preserve"> (combine </w:t>
+      </w:r>
+      <w:proofErr w:type="spellStart"/>
+      <w:r>
+        <w:rPr>
+          <w:rFonts w:ascii="Times New Roman" w:hAnsi="Times New Roman" w:cs="Times New Roman"/>
+        </w:rPr>
+        <w:t>mt</w:t>
+      </w:r>
+      <w:proofErr w:type="spellEnd"/>
+      <w:r>
+        <w:rPr>
+          <w:rFonts w:ascii="Times New Roman" w:hAnsi="Times New Roman" w:cs="Times New Roman"/>
+        </w:rPr>
+        <w:t>, mb)</w:t>
+      </w:r>
+    </w:p>
+    <w:p>
+      <w:pPr>
+        <w:rPr>
+          <w:rFonts w:ascii="Times New Roman" w:hAnsi="Times New Roman" w:cs="Times New Roman"/>
+          <w:b/>
+          <w:bCs/>
+        </w:rPr>
+      </w:pPr>
+      <w:r>
+        <w:rPr>
+          <w:rFonts w:ascii="Times New Roman" w:hAnsi="Times New Roman" w:cs="Times New Roman"/>
+          <w:b/>
+          <w:bCs/>
+        </w:rPr>
+        <w:t xml:space="preserve"> for grid view:</w:t>
+      </w:r>
+    </w:p>
+    <w:p>
+      <w:pPr>
+        <w:rPr>
+          <w:rFonts w:ascii="Times New Roman" w:hAnsi="Times New Roman" w:cs="Times New Roman"/>
+          <w:b/>
+          <w:bCs/>
+        </w:rPr>
+      </w:pPr>
+      <w:r>
+        <w:rPr>
+          <w:rFonts w:ascii="Times New Roman" w:hAnsi="Times New Roman" w:cs="Times New Roman"/>
+          <w:b/>
+          <w:bCs/>
+        </w:rPr>
+        <w:t>row</w:t>
+      </w:r>
+    </w:p>
+    <w:p>
+      <w:pPr>
+        <w:rPr>
+          <w:rFonts w:ascii="Times New Roman" w:hAnsi="Times New Roman" w:cs="Times New Roman"/>
+          <w:b/>
+          <w:bCs/>
+        </w:rPr>
+      </w:pPr>
+      <w:r>
+        <w:rPr>
+          <w:rFonts w:ascii="Times New Roman" w:hAnsi="Times New Roman" w:cs="Times New Roman"/>
+          <w:b/>
+          <w:bCs/>
+        </w:rPr>
+        <w:t>col</w:t>
+      </w:r>
+    </w:p>
+    <w:p>
+      <w:pPr>
+        <w:rPr>
+          <w:rFonts w:ascii="Times New Roman" w:hAnsi="Times New Roman" w:cs="Times New Roman"/>
+          <w:b/>
+          <w:bCs/>
+        </w:rPr>
+      </w:pPr>
+      <w:r>
+        <w:rPr>
+          <w:rFonts w:ascii="Times New Roman" w:hAnsi="Times New Roman" w:cs="Times New Roman"/>
+          <w:b/>
+          <w:bCs/>
+        </w:rPr>
+        <w:t>Bootstrap grid is based on a 12-column system</w:t>
+      </w:r>
+    </w:p>
+    <w:p>
+      <w:pPr>
+        <w:pStyle w:val="ListParagraph"/>
+        <w:numPr>
+          <w:ilvl w:val="0"/>
+          <w:numId w:val="1"/>
+        </w:numPr>
+        <w:rPr>
+          <w:rFonts w:ascii="Times New Roman" w:hAnsi="Times New Roman" w:cs="Times New Roman"/>
+        </w:rPr>
+      </w:pPr>
+      <w:r>
+        <w:rPr>
+          <w:rFonts w:ascii="Times New Roman" w:hAnsi="Times New Roman" w:cs="Times New Roman"/>
+        </w:rPr>
+        <w:t xml:space="preserve">col-md-3: </w:t>
+      </w:r>
+    </w:p>
+    <w:p>
+      <w:pPr>
+        <w:pStyle w:val="ListParagraph"/>
+        <w:numPr>
+          <w:ilvl w:val="1"/>
+          <w:numId w:val="1"/>
+        </w:numPr>
+        <w:rPr>
+          <w:rFonts w:ascii="Times New Roman" w:hAnsi="Times New Roman" w:cs="Times New Roman"/>
+        </w:rPr>
+      </w:pPr>
+      <w:r>
+        <w:rPr>
+          <w:rFonts w:ascii="Times New Roman" w:hAnsi="Times New Roman" w:cs="Times New Roman"/>
+        </w:rPr>
+        <w:t>col: column</w:t>
+      </w:r>
+    </w:p>
+    <w:p>
+      <w:pPr>
+        <w:pStyle w:val="ListParagraph"/>
+        <w:numPr>
+          <w:ilvl w:val="1"/>
+          <w:numId w:val="1"/>
+        </w:numPr>
+        <w:rPr>
+          <w:rFonts w:ascii="Times New Roman" w:hAnsi="Times New Roman" w:cs="Times New Roman"/>
+        </w:rPr>
+      </w:pPr>
+      <w:r>
+        <w:rPr>
+          <w:rFonts w:ascii="Times New Roman" w:hAnsi="Times New Roman" w:cs="Times New Roman"/>
+        </w:rPr>
+        <w:t>md: medium</w:t>
+      </w:r>
+    </w:p>
+    <w:p>
+      <w:pPr>
+        <w:pStyle w:val="ListParagraph"/>
+        <w:numPr>
+          <w:ilvl w:val="1"/>
+          <w:numId w:val="1"/>
+        </w:numPr>
+        <w:rPr>
+          <w:rFonts w:ascii="Times New Roman" w:hAnsi="Times New Roman" w:cs="Times New Roman"/>
+        </w:rPr>
+      </w:pPr>
+      <w:r>
+        <w:rPr>
+          <w:rFonts w:ascii="Times New Roman" w:hAnsi="Times New Roman" w:cs="Times New Roman"/>
+        </w:rPr>
+        <w:t>3: specifies</w:t>
+      </w:r>
+      <w:r>
+        <w:rPr>
+          <w:rFonts w:ascii="Times New Roman" w:hAnsi="Times New Roman" w:cs="Times New Roman"/>
+        </w:rPr>
+        <w:t xml:space="preserve"> that column should take 3 out of 12 columns of available horizontally.</w:t>
+      </w:r>
+    </w:p>
+    <w:p>
+      <w:pPr>
+        <w:rPr>
+          <w:rFonts w:ascii="Times New Roman" w:hAnsi="Times New Roman" w:cs="Times New Roman"/>
+          <w:b/>
+          <w:bCs/>
+        </w:rPr>
+      </w:pPr>
+      <w:r>
+        <w:rPr>
+          <w:rFonts w:ascii="Times New Roman" w:hAnsi="Times New Roman" w:cs="Times New Roman"/>
+          <w:b/>
+          <w:bCs/>
+        </w:rPr>
+        <w:t>Flex:</w:t>
+      </w:r>
+    </w:p>
+    <w:p>
+      <w:pPr>
+        <w:pStyle w:val="ListParagraph"/>
+        <w:numPr>
+          <w:ilvl w:val="0"/>
+          <w:numId w:val="1"/>
+        </w:numPr>
+        <w:rPr>
+          <w:rFonts w:ascii="Times New Roman" w:hAnsi="Times New Roman" w:cs="Times New Roman"/>
+          <w:b/>
+          <w:bCs/>
+        </w:rPr>
+      </w:pPr>
+      <w:r>
+        <w:rPr>
+          <w:rFonts w:ascii="Times New Roman" w:hAnsi="Times New Roman" w:cs="Times New Roman"/>
+        </w:rPr>
+        <w:t xml:space="preserve">d-flex: </w:t>
+      </w:r>
+      <w:proofErr w:type="spellStart"/>
+      <w:r>
+        <w:rPr>
+          <w:rFonts w:ascii="Times New Roman" w:hAnsi="Times New Roman" w:cs="Times New Roman"/>
+        </w:rPr>
+        <w:t>display:flex</w:t>
+      </w:r>
+      <w:proofErr w:type="spellEnd"/>
+    </w:p>
+    <w:p>
+      <w:pPr>
+        <w:pStyle w:val="ListParagraph"/>
+        <w:numPr>
+          <w:ilvl w:val="0"/>
+          <w:numId w:val="1"/>
+        </w:numPr>
+        <w:rPr>
+          <w:rFonts w:ascii="Times New Roman" w:hAnsi="Times New Roman" w:cs="Times New Roman"/>
+        </w:rPr>
+      </w:pPr>
+      <w:r>
+        <w:rPr>
+          <w:rFonts w:ascii="Times New Roman" w:hAnsi="Times New Roman" w:cs="Times New Roman"/>
+        </w:rPr>
+        <w:t>f</w:t>
+      </w:r>
+      <w:r>
+        <w:rPr>
+          <w:rFonts w:ascii="Times New Roman" w:hAnsi="Times New Roman" w:cs="Times New Roman"/>
+        </w:rPr>
+        <w:t>lex-column:</w:t>
+      </w:r>
+      <w:r>
+        <w:rPr>
+          <w:rFonts w:ascii="Times New Roman" w:hAnsi="Times New Roman" w:cs="Times New Roman"/>
+        </w:rPr>
+        <w:t xml:space="preserve"> </w:t>
+      </w:r>
+      <w:r>
+        <w:rPr>
+          <w:rFonts w:ascii="Times New Roman" w:hAnsi="Times New Roman" w:cs="Times New Roman"/>
+        </w:rPr>
+        <w:t>flex-direction: column;</w:t>
+      </w:r>
+    </w:p>
+    <w:p>
+      <w:pPr>
+        <w:pStyle w:val="ListParagraph"/>
+        <w:numPr>
+          <w:ilvl w:val="1"/>
+          <w:numId w:val="1"/>
+        </w:numPr>
+        <w:rPr>
+          <w:rFonts w:ascii="Times New Roman" w:hAnsi="Times New Roman" w:cs="Times New Roman"/>
+        </w:rPr>
+      </w:pPr>
+      <w:r>
+        <w:rPr>
+          <w:rFonts w:ascii="Times New Roman" w:hAnsi="Times New Roman" w:cs="Times New Roman"/>
+        </w:rPr>
+        <w:t>Using both d-flex and flex-column together allows you to create flexible column layouts.</w:t>
+      </w:r>
+    </w:p>
+    <w:p>
+      <w:pPr>
+        <w:rPr>
+          <w:rFonts w:ascii="Times New Roman" w:hAnsi="Times New Roman" w:cs="Times New Roman"/>
+          <w:b/>
+          <w:bCs/>
+        </w:rPr>
+      </w:pPr>
+      <w:r>
+        <w:rPr>
+          <w:rFonts w:ascii="Times New Roman" w:hAnsi="Times New Roman" w:cs="Times New Roman"/>
+          <w:b/>
+          <w:bCs/>
+        </w:rPr>
+        <w:t>Padding:</w:t>
+      </w:r>
+    </w:p>
+    <w:p>
+      <w:pPr>
+        <w:pStyle w:val="ListParagraph"/>
+        <w:numPr>
+          <w:ilvl w:val="0"/>
+          <w:numId w:val="1"/>
+        </w:numPr>
+        <w:rPr>
+          <w:rFonts w:ascii="Times New Roman" w:hAnsi="Times New Roman" w:cs="Times New Roman"/>
+          <w:b/>
+          <w:bCs/>
+        </w:rPr>
+      </w:pPr>
+      <w:r>
+        <w:rPr>
+          <w:rFonts w:ascii="Times New Roman" w:hAnsi="Times New Roman" w:cs="Times New Roman"/>
+          <w:b/>
+          <w:bCs/>
+        </w:rPr>
+        <w:t>p</w:t>
+      </w:r>
+    </w:p>
+    <w:p>
+      <w:pPr>
+        <w:pStyle w:val="ListParagraph"/>
+        <w:numPr>
+          <w:ilvl w:val="0"/>
+          <w:numId w:val="1"/>
+        </w:numPr>
+        <w:rPr>
+          <w:rFonts w:ascii="Times New Roman" w:hAnsi="Times New Roman" w:cs="Times New Roman"/>
+          <w:b/>
+          <w:bCs/>
+        </w:rPr>
+      </w:pPr>
+      <w:r>
+        <w:rPr>
+          <w:rFonts w:ascii="Times New Roman" w:hAnsi="Times New Roman" w:cs="Times New Roman"/>
+          <w:b/>
+          <w:bCs/>
+        </w:rPr>
+        <w:t>pt</w:t>
+      </w:r>
+    </w:p>
+    <w:p>
+      <w:pPr>
+        <w:pStyle w:val="ListParagraph"/>
+        <w:numPr>
+          <w:ilvl w:val="0"/>
+          <w:numId w:val="1"/>
+        </w:numPr>
+        <w:rPr>
+          <w:rFonts w:ascii="Times New Roman" w:hAnsi="Times New Roman" w:cs="Times New Roman"/>
+          <w:b/>
+          <w:bCs/>
+        </w:rPr>
+      </w:pPr>
+      <w:r>
+        <w:rPr>
+          <w:rFonts w:ascii="Times New Roman" w:hAnsi="Times New Roman" w:cs="Times New Roman"/>
+          <w:b/>
+          <w:bCs/>
+        </w:rPr>
+        <w:t>pb</w:t>
+      </w:r>
+    </w:p>
+    <w:p>
+      <w:pPr>
+        <w:pStyle w:val="ListParagraph"/>
+        <w:numPr>
+          <w:ilvl w:val="0"/>
+          <w:numId w:val="1"/>
+        </w:numPr>
+        <w:rPr>
+          <w:rFonts w:ascii="Times New Roman" w:hAnsi="Times New Roman" w:cs="Times New Roman"/>
+          <w:b/>
+          <w:bCs/>
+        </w:rPr>
+      </w:pPr>
+      <w:r>
+        <w:rPr>
+          <w:rFonts w:ascii="Times New Roman" w:hAnsi="Times New Roman" w:cs="Times New Roman"/>
+          <w:b/>
+          <w:bCs/>
+        </w:rPr>
+        <w:t>pl</w:t>
+      </w:r>
+    </w:p>
+    <w:p>
+      <w:pPr>
+        <w:pStyle w:val="ListParagraph"/>
+        <w:numPr>
+          <w:ilvl w:val="0"/>
+          <w:numId w:val="1"/>
+        </w:numPr>
+        <w:rPr>
+          <w:rFonts w:ascii="Times New Roman" w:hAnsi="Times New Roman" w:cs="Times New Roman"/>
+          <w:b/>
+          <w:bCs/>
+        </w:rPr>
+      </w:pPr>
+      <w:r>
+        <w:rPr>
+          <w:rFonts w:ascii="Times New Roman" w:hAnsi="Times New Roman" w:cs="Times New Roman"/>
+          <w:b/>
+          <w:bCs/>
+        </w:rPr>
+        <w:t>pr</w:t>
+      </w:r>
+    </w:p>
+    <w:p>
+      <w:pPr>
+        <w:pStyle w:val="ListParagraph"/>
+        <w:numPr>
+          <w:ilvl w:val="0"/>
+          <w:numId w:val="1"/>
+        </w:numPr>
+        <w:rPr>
+          <w:rFonts w:ascii="Times New Roman" w:hAnsi="Times New Roman" w:cs="Times New Roman"/>
+          <w:b/>
+          <w:bCs/>
+        </w:rPr>
+      </w:pPr>
+      <w:proofErr w:type="spellStart"/>
+      <w:r>
+        <w:rPr>
+          <w:rFonts w:ascii="Times New Roman" w:hAnsi="Times New Roman" w:cs="Times New Roman"/>
+          <w:b/>
+          <w:bCs/>
+        </w:rPr>
+        <w:t>px</w:t>
+      </w:r>
+      <w:proofErr w:type="spellEnd"/>
+    </w:p>
+    <w:p>
+      <w:pPr>
+        <w:pStyle w:val="ListParagraph"/>
+        <w:numPr>
+          <w:ilvl w:val="0"/>
+          <w:numId w:val="1"/>
+        </w:numPr>
+        <w:rPr>
+          <w:rFonts w:ascii="Times New Roman" w:hAnsi="Times New Roman" w:cs="Times New Roman"/>
+          <w:b/>
+          <w:bCs/>
+        </w:rPr>
+      </w:pPr>
+      <w:proofErr w:type="spellStart"/>
+      <w:r>
+        <w:rPr>
+          <w:rFonts w:ascii="Times New Roman" w:hAnsi="Times New Roman" w:cs="Times New Roman"/>
+          <w:b/>
+          <w:bCs/>
+        </w:rPr>
+        <w:t>py</w:t>
+      </w:r>
+      <w:proofErr w:type="spellEnd"/>
+    </w:p>
+    <w:p>
+      <w:pPr>
+        <w:rPr>
+          <w:rFonts w:ascii="Times New Roman" w:hAnsi="Times New Roman" w:cs="Times New Roman"/>
+          <w:b/>
+          <w:bCs/>
+        </w:rPr>
+      </w:pPr>
+    </w:p>
+    <w:p>
+      <w:pPr>
+        <w:rPr>
+          <w:rFonts w:ascii="Times New Roman" w:hAnsi="Times New Roman" w:cs="Times New Roman"/>
+        </w:rPr>
+      </w:pPr>
+    </w:p>
+    <w:p>
+      <w:pPr>
+        <w:rPr>
+          <w:rFonts w:ascii="Times New Roman" w:hAnsi="Times New Roman" w:cs="Times New Roman"/>
+          <w:b/>
+          <w:bCs/>
+        </w:rPr>
+      </w:pPr>
+    </w:p>
+    <w:p>
+      <w:pPr>
+        <w:rPr>
+          <w:rFonts w:ascii="Times New Roman" w:hAnsi="Times New Roman" w:cs="Times New Roman"/>
+          <w:b/>
+          <w:bCs/>
+        </w:rPr>
+      </w:pPr>
+    </w:p>
+    <w:p>
+      <w:pPr>
+        <w:rPr>
+          <w:rFonts w:ascii="Times New Roman" w:hAnsi="Times New Roman" w:cs="Times New Roman"/>
+          <w:b/>
+          <w:bCs/>
+        </w:rPr>
+      </w:pPr>
+    </w:p>
+    <w:p>
+      <w:pPr>
+        <w:rPr>
+          <w:rFonts w:ascii="Times New Roman" w:hAnsi="Times New Roman" w:cs="Times New Roman"/>
+        </w:rPr>
+      </w:pPr>
     </w:p>
     <w:p>
       <w:pPr>

</xml_diff>

<commit_message>
final Bootstap and Basic JS
</commit_message>
<xml_diff>
--- a/Bootstrap/Bootstrap.docx
+++ b/Bootstrap/Bootstrap.docx
@@ -1004,7 +1004,21 @@
         <w:rPr>
           <w:rFonts w:ascii="Times New Roman" w:hAnsi="Times New Roman" w:cs="Times New Roman"/>
         </w:rPr>
-        <w:t xml:space="preserve">See the bootstrap code  again in detail </w:t>
+        <w:t xml:space="preserve">See the bootstrap </w:t>
+      </w:r>
+      <w:proofErr w:type="gramStart"/>
+      <w:r>
+        <w:rPr>
+          <w:rFonts w:ascii="Times New Roman" w:hAnsi="Times New Roman" w:cs="Times New Roman"/>
+        </w:rPr>
+        <w:t>code  again</w:t>
+      </w:r>
+      <w:proofErr w:type="gramEnd"/>
+      <w:r>
+        <w:rPr>
+          <w:rFonts w:ascii="Times New Roman" w:hAnsi="Times New Roman" w:cs="Times New Roman"/>
+        </w:rPr>
+        <w:t xml:space="preserve"> in detail </w:t>
       </w:r>
     </w:p>
     <w:p>
@@ -1535,6 +1549,7 @@
         <w:t xml:space="preserve">d-flex: </w:t>
       </w:r>
       <w:proofErr w:type="spellStart"/>
+      <w:proofErr w:type="gramStart"/>
       <w:r>
         <w:rPr>
           <w:rFonts w:ascii="Times New Roman" w:hAnsi="Times New Roman" w:cs="Times New Roman"/>
@@ -1542,6 +1557,7 @@
         <w:t>display:flex</w:t>
       </w:r>
       <w:proofErr w:type="spellEnd"/>
+      <w:proofErr w:type="gramEnd"/>
     </w:p>
     <w:p>
       <w:pPr>
@@ -1558,13 +1574,7 @@
         <w:rPr>
           <w:rFonts w:ascii="Times New Roman" w:hAnsi="Times New Roman" w:cs="Times New Roman"/>
         </w:rPr>
-        <w:t>f</w:t>
-      </w:r>
-      <w:r>
-        <w:rPr>
-          <w:rFonts w:ascii="Times New Roman" w:hAnsi="Times New Roman" w:cs="Times New Roman"/>
-        </w:rPr>
-        <w:t>lex-column:</w:t>
+        <w:t>flex-column:</w:t>
       </w:r>
       <w:r>
         <w:rPr>
@@ -1771,6 +1781,88 @@
         <w:t>py</w:t>
       </w:r>
       <w:proofErr w:type="spellEnd"/>
+    </w:p>
+    <w:p>
+      <w:pPr>
+        <w:ind w:left="360"/>
+        <w:rPr>
+          <w:rFonts w:ascii="Times New Roman" w:hAnsi="Times New Roman" w:cs="Times New Roman"/>
+        </w:rPr>
+      </w:pPr>
+    </w:p>
+    <w:p>
+      <w:pPr>
+        <w:pStyle w:val="ListParagraph"/>
+        <w:numPr>
+          <w:ilvl w:val="0"/>
+          <w:numId w:val="2"/>
+        </w:numPr>
+        <w:rPr>
+          <w:rFonts w:ascii="Times New Roman" w:hAnsi="Times New Roman" w:cs="Times New Roman"/>
+        </w:rPr>
+      </w:pPr>
+      <w:r>
+        <w:rPr>
+          <w:rFonts w:ascii="Times New Roman" w:hAnsi="Times New Roman" w:cs="Times New Roman"/>
+        </w:rPr>
+        <w:t xml:space="preserve">The outline button classes in Bootstrap 5 typically follow the format </w:t>
+      </w:r>
+      <w:proofErr w:type="spellStart"/>
+      <w:r>
+        <w:rPr>
+          <w:rFonts w:ascii="Times New Roman" w:hAnsi="Times New Roman" w:cs="Times New Roman"/>
+        </w:rPr>
+        <w:t>btn</w:t>
+      </w:r>
+      <w:proofErr w:type="spellEnd"/>
+      <w:r>
+        <w:rPr>
+          <w:rFonts w:ascii="Times New Roman" w:hAnsi="Times New Roman" w:cs="Times New Roman"/>
+        </w:rPr>
+        <w:t>-outline-{</w:t>
+      </w:r>
+      <w:proofErr w:type="spellStart"/>
+      <w:r>
+        <w:rPr>
+          <w:rFonts w:ascii="Times New Roman" w:hAnsi="Times New Roman" w:cs="Times New Roman"/>
+        </w:rPr>
+        <w:t>color</w:t>
+      </w:r>
+      <w:proofErr w:type="spellEnd"/>
+      <w:r>
+        <w:rPr>
+          <w:rFonts w:ascii="Times New Roman" w:hAnsi="Times New Roman" w:cs="Times New Roman"/>
+        </w:rPr>
+        <w:t>}, where {</w:t>
+      </w:r>
+      <w:proofErr w:type="spellStart"/>
+      <w:r>
+        <w:rPr>
+          <w:rFonts w:ascii="Times New Roman" w:hAnsi="Times New Roman" w:cs="Times New Roman"/>
+        </w:rPr>
+        <w:t>color</w:t>
+      </w:r>
+      <w:proofErr w:type="spellEnd"/>
+      <w:r>
+        <w:rPr>
+          <w:rFonts w:ascii="Times New Roman" w:hAnsi="Times New Roman" w:cs="Times New Roman"/>
+        </w:rPr>
+        <w:t xml:space="preserve">} can be one of the standard </w:t>
+      </w:r>
+      <w:proofErr w:type="spellStart"/>
+      <w:r>
+        <w:rPr>
+          <w:rFonts w:ascii="Times New Roman" w:hAnsi="Times New Roman" w:cs="Times New Roman"/>
+        </w:rPr>
+        <w:t>colors</w:t>
+      </w:r>
+      <w:proofErr w:type="spellEnd"/>
+      <w:r>
+        <w:rPr>
+          <w:rFonts w:ascii="Times New Roman" w:hAnsi="Times New Roman" w:cs="Times New Roman"/>
+        </w:rPr>
+        <w:t xml:space="preserve"> provided by Bootstrap, like primary, secondary, success, danger, warning, info, light, dark, or white.</w:t>
+      </w:r>
     </w:p>
     <w:p>
       <w:pPr>
@@ -1845,7 +1937,7 @@
   <w:abstractNum w:abstractNumId="0" w15:restartNumberingAfterBreak="0">
     <w:nsid w:val="5B103779"/>
     <w:multiLevelType w:val="hybridMultilevel"/>
-    <w:tmpl w:val="B2444D50"/>
+    <w:tmpl w:val="0DACC24C"/>
     <w:lvl w:ilvl="0" w:tplc="9620BC2E">
       <w:numFmt w:val="bullet"/>
       <w:lvlText w:val="-"/>
@@ -1954,8 +2046,124 @@
       </w:rPr>
     </w:lvl>
   </w:abstractNum>
+  <w:abstractNum w:abstractNumId="1" w15:restartNumberingAfterBreak="0">
+    <w:nsid w:val="775C4E4A"/>
+    <w:multiLevelType w:val="hybridMultilevel"/>
+    <w:tmpl w:val="5B66A9C8"/>
+    <w:lvl w:ilvl="0" w:tplc="40090001">
+      <w:start w:val="1"/>
+      <w:numFmt w:val="bullet"/>
+      <w:lvlText w:val=""/>
+      <w:lvlJc w:val="left"/>
+      <w:pPr>
+        <w:ind w:left="720" w:hanging="360"/>
+      </w:pPr>
+      <w:rPr>
+        <w:rFonts w:ascii="Symbol" w:hAnsi="Symbol" w:hint="default"/>
+      </w:rPr>
+    </w:lvl>
+    <w:lvl w:ilvl="1" w:tplc="40090003" w:tentative="1">
+      <w:start w:val="1"/>
+      <w:numFmt w:val="bullet"/>
+      <w:lvlText w:val="o"/>
+      <w:lvlJc w:val="left"/>
+      <w:pPr>
+        <w:ind w:left="1440" w:hanging="360"/>
+      </w:pPr>
+      <w:rPr>
+        <w:rFonts w:ascii="Courier New" w:hAnsi="Courier New" w:cs="Courier New" w:hint="default"/>
+      </w:rPr>
+    </w:lvl>
+    <w:lvl w:ilvl="2" w:tplc="40090005" w:tentative="1">
+      <w:start w:val="1"/>
+      <w:numFmt w:val="bullet"/>
+      <w:lvlText w:val=""/>
+      <w:lvlJc w:val="left"/>
+      <w:pPr>
+        <w:ind w:left="2160" w:hanging="360"/>
+      </w:pPr>
+      <w:rPr>
+        <w:rFonts w:ascii="Wingdings" w:hAnsi="Wingdings" w:hint="default"/>
+      </w:rPr>
+    </w:lvl>
+    <w:lvl w:ilvl="3" w:tplc="40090001" w:tentative="1">
+      <w:start w:val="1"/>
+      <w:numFmt w:val="bullet"/>
+      <w:lvlText w:val=""/>
+      <w:lvlJc w:val="left"/>
+      <w:pPr>
+        <w:ind w:left="2880" w:hanging="360"/>
+      </w:pPr>
+      <w:rPr>
+        <w:rFonts w:ascii="Symbol" w:hAnsi="Symbol" w:hint="default"/>
+      </w:rPr>
+    </w:lvl>
+    <w:lvl w:ilvl="4" w:tplc="40090003" w:tentative="1">
+      <w:start w:val="1"/>
+      <w:numFmt w:val="bullet"/>
+      <w:lvlText w:val="o"/>
+      <w:lvlJc w:val="left"/>
+      <w:pPr>
+        <w:ind w:left="3600" w:hanging="360"/>
+      </w:pPr>
+      <w:rPr>
+        <w:rFonts w:ascii="Courier New" w:hAnsi="Courier New" w:cs="Courier New" w:hint="default"/>
+      </w:rPr>
+    </w:lvl>
+    <w:lvl w:ilvl="5" w:tplc="40090005" w:tentative="1">
+      <w:start w:val="1"/>
+      <w:numFmt w:val="bullet"/>
+      <w:lvlText w:val=""/>
+      <w:lvlJc w:val="left"/>
+      <w:pPr>
+        <w:ind w:left="4320" w:hanging="360"/>
+      </w:pPr>
+      <w:rPr>
+        <w:rFonts w:ascii="Wingdings" w:hAnsi="Wingdings" w:hint="default"/>
+      </w:rPr>
+    </w:lvl>
+    <w:lvl w:ilvl="6" w:tplc="40090001" w:tentative="1">
+      <w:start w:val="1"/>
+      <w:numFmt w:val="bullet"/>
+      <w:lvlText w:val=""/>
+      <w:lvlJc w:val="left"/>
+      <w:pPr>
+        <w:ind w:left="5040" w:hanging="360"/>
+      </w:pPr>
+      <w:rPr>
+        <w:rFonts w:ascii="Symbol" w:hAnsi="Symbol" w:hint="default"/>
+      </w:rPr>
+    </w:lvl>
+    <w:lvl w:ilvl="7" w:tplc="40090003" w:tentative="1">
+      <w:start w:val="1"/>
+      <w:numFmt w:val="bullet"/>
+      <w:lvlText w:val="o"/>
+      <w:lvlJc w:val="left"/>
+      <w:pPr>
+        <w:ind w:left="5760" w:hanging="360"/>
+      </w:pPr>
+      <w:rPr>
+        <w:rFonts w:ascii="Courier New" w:hAnsi="Courier New" w:cs="Courier New" w:hint="default"/>
+      </w:rPr>
+    </w:lvl>
+    <w:lvl w:ilvl="8" w:tplc="40090005" w:tentative="1">
+      <w:start w:val="1"/>
+      <w:numFmt w:val="bullet"/>
+      <w:lvlText w:val=""/>
+      <w:lvlJc w:val="left"/>
+      <w:pPr>
+        <w:ind w:left="6480" w:hanging="360"/>
+      </w:pPr>
+      <w:rPr>
+        <w:rFonts w:ascii="Wingdings" w:hAnsi="Wingdings" w:hint="default"/>
+      </w:rPr>
+    </w:lvl>
+  </w:abstractNum>
   <w:num w:numId="1" w16cid:durableId="1618559335">
     <w:abstractNumId w:val="0"/>
+  </w:num>
+  <w:num w:numId="2" w16cid:durableId="1617834543">
+    <w:abstractNumId w:val="1"/>
   </w:num>
 </w:numbering>
 </file>

</xml_diff>